<commit_message>
Format Python source with Ruff
</commit_message>
<xml_diff>
--- a/lab_4/report.docx
+++ b/lab_4/report.docx
@@ -9869,7 +9869,41 @@
           <w:i w:val="0"/>
           <w:sz w:val="22"/>
         </w:rPr>
-        <w:t xml:space="preserve">    canonical_input = text.upper().replace("Ё", "Е").replace("\r\n", " ").replace("\r", " ").replace("\n", " ")</w:t>
+        <w:t xml:space="preserve">    canonical_input = (</w:t>
+      </w:r>
+    </w:p>
+    <w:p>
+      <w:pPr>
+        <w:keepLines w:val="0"/>
+        <w:spacing w:before="0" w:after="0" w:line="240" w:lineRule="auto"/>
+        <w:ind w:firstLine="0" w:left="0"/>
+        <w:jc w:val="left"/>
+      </w:pPr>
+      <w:r>
+        <w:rPr>
+          <w:rFonts w:ascii="DejaVu Sans" w:hAnsi="DejaVu Sans" w:eastAsia="DejaVu Sans" w:cs="DejaVu Sans"/>
+          <w:b w:val="0"/>
+          <w:i w:val="0"/>
+          <w:sz w:val="22"/>
+        </w:rPr>
+        <w:t xml:space="preserve">        text.upper().replace("Ё", "Е").replace("\r\n", " ").replace("\r", " ").replace("\n", " ")</w:t>
+      </w:r>
+    </w:p>
+    <w:p>
+      <w:pPr>
+        <w:keepLines w:val="0"/>
+        <w:spacing w:before="0" w:after="0" w:line="240" w:lineRule="auto"/>
+        <w:ind w:firstLine="0" w:left="0"/>
+        <w:jc w:val="left"/>
+      </w:pPr>
+      <w:r>
+        <w:rPr>
+          <w:rFonts w:ascii="DejaVu Sans" w:hAnsi="DejaVu Sans" w:eastAsia="DejaVu Sans" w:cs="DejaVu Sans"/>
+          <w:b w:val="0"/>
+          <w:i w:val="0"/>
+          <w:sz w:val="22"/>
+        </w:rPr>
+        <w:t xml:space="preserve">    )</w:t>
       </w:r>
     </w:p>
     <w:p>
@@ -10005,24 +10039,7 @@
           <w:i w:val="0"/>
           <w:sz w:val="22"/>
         </w:rPr>
-        <w:t xml:space="preserve">        f"{SPACE_CODE:02d}" if char == " " else f"{SYMBOL_TO_CODE[char]:02d}"</w:t>
-      </w:r>
-    </w:p>
-    <w:p>
-      <w:pPr>
-        <w:keepLines w:val="0"/>
-        <w:spacing w:before="0" w:after="0" w:line="240" w:lineRule="auto"/>
-        <w:ind w:firstLine="0" w:left="0"/>
-        <w:jc w:val="left"/>
-      </w:pPr>
-      <w:r>
-        <w:rPr>
-          <w:rFonts w:ascii="DejaVu Sans" w:hAnsi="DejaVu Sans" w:eastAsia="DejaVu Sans" w:cs="DejaVu Sans"/>
-          <w:b w:val="0"/>
-          <w:i w:val="0"/>
-          <w:sz w:val="22"/>
-        </w:rPr>
-        <w:t xml:space="preserve">        for char in canonical</w:t>
+        <w:t xml:space="preserve">        f"{SPACE_CODE:02d}" if char == " " else f"{SYMBOL_TO_CODE[char]:02d}" for char in canonical</w:t>
       </w:r>
     </w:p>
     <w:p>
@@ -11021,7 +11038,7 @@
           <w:i w:val="0"/>
           <w:sz w:val="22"/>
         </w:rPr>
-        <w:t xml:space="preserve">        cipher_block = int(ciphertext[offset:offset + width])</w:t>
+        <w:t xml:space="preserve">        cipher_block = int(ciphertext[offset : offset + width])</w:t>
       </w:r>
     </w:p>
     <w:p>
@@ -11123,7 +11140,41 @@
           <w:i w:val="0"/>
           <w:sz w:val="22"/>
         </w:rPr>
-        <w:t xml:space="preserve">            raise ValueError("Расшифрованный блок начинается с нуля: неверный ключ или повреждённые данные.")</w:t>
+        <w:t xml:space="preserve">            raise ValueError(</w:t>
+      </w:r>
+    </w:p>
+    <w:p>
+      <w:pPr>
+        <w:keepLines w:val="0"/>
+        <w:spacing w:before="0" w:after="0" w:line="240" w:lineRule="auto"/>
+        <w:ind w:firstLine="0" w:left="0"/>
+        <w:jc w:val="left"/>
+      </w:pPr>
+      <w:r>
+        <w:rPr>
+          <w:rFonts w:ascii="DejaVu Sans" w:hAnsi="DejaVu Sans" w:eastAsia="DejaVu Sans" w:cs="DejaVu Sans"/>
+          <w:b w:val="0"/>
+          <w:i w:val="0"/>
+          <w:sz w:val="22"/>
+        </w:rPr>
+        <w:t xml:space="preserve">                "Расшифрованный блок начинается с нуля: неверный ключ или повреждённые данные."</w:t>
+      </w:r>
+    </w:p>
+    <w:p>
+      <w:pPr>
+        <w:keepLines w:val="0"/>
+        <w:spacing w:before="0" w:after="0" w:line="240" w:lineRule="auto"/>
+        <w:ind w:firstLine="0" w:left="0"/>
+        <w:jc w:val="left"/>
+      </w:pPr>
+      <w:r>
+        <w:rPr>
+          <w:rFonts w:ascii="DejaVu Sans" w:hAnsi="DejaVu Sans" w:eastAsia="DejaVu Sans" w:cs="DejaVu Sans"/>
+          <w:b w:val="0"/>
+          <w:i w:val="0"/>
+          <w:sz w:val="22"/>
+        </w:rPr>
+        <w:t xml:space="preserve">            )</w:t>
       </w:r>
     </w:p>
     <w:p>
@@ -11242,7 +11293,7 @@
           <w:i w:val="0"/>
           <w:sz w:val="22"/>
         </w:rPr>
-        <w:t xml:space="preserve">        code = int(digit_stream[pair_start:pair_start + 2])</w:t>
+        <w:t xml:space="preserve">        code = int(digit_stream[pair_start : pair_start + 2])</w:t>
       </w:r>
     </w:p>
     <w:p>
@@ -12343,41 +12394,75 @@
           <w:i w:val="0"/>
           <w:sz w:val="22"/>
         </w:rPr>
-        <w:t xml:space="preserve">        print(f"{index:&lt;3} ({key.e}, {key.n}){(20 - len(str(key.e)) - len(str(key.n))) * ' '}"</w:t>
-      </w:r>
-    </w:p>
-    <w:p>
-      <w:pPr>
-        <w:keepLines w:val="0"/>
-        <w:spacing w:before="0" w:after="0" w:line="240" w:lineRule="auto"/>
-        <w:ind w:firstLine="0" w:left="0"/>
-        <w:jc w:val="left"/>
-      </w:pPr>
-      <w:r>
-        <w:rPr>
-          <w:rFonts w:ascii="DejaVu Sans" w:hAnsi="DejaVu Sans" w:eastAsia="DejaVu Sans" w:cs="DejaVu Sans"/>
-          <w:b w:val="0"/>
-          <w:i w:val="0"/>
-          <w:sz w:val="22"/>
-        </w:rPr>
-        <w:t xml:space="preserve">              f"({key.d}, {key.n}){(20 - len(str(key.d)) - len(str(key.n))) * ' '}"</w:t>
-      </w:r>
-    </w:p>
-    <w:p>
-      <w:pPr>
-        <w:keepLines w:val="0"/>
-        <w:spacing w:before="0" w:after="0" w:line="240" w:lineRule="auto"/>
-        <w:ind w:firstLine="0" w:left="0"/>
-        <w:jc w:val="left"/>
-      </w:pPr>
-      <w:r>
-        <w:rPr>
-          <w:rFonts w:ascii="DejaVu Sans" w:hAnsi="DejaVu Sans" w:eastAsia="DejaVu Sans" w:cs="DejaVu Sans"/>
-          <w:b w:val="0"/>
-          <w:i w:val="0"/>
-          <w:sz w:val="22"/>
-        </w:rPr>
-        <w:t xml:space="preserve">              f"{(key.e * key.d) % key.phi}")</w:t>
+        <w:t xml:space="preserve">        print(</w:t>
+      </w:r>
+    </w:p>
+    <w:p>
+      <w:pPr>
+        <w:keepLines w:val="0"/>
+        <w:spacing w:before="0" w:after="0" w:line="240" w:lineRule="auto"/>
+        <w:ind w:firstLine="0" w:left="0"/>
+        <w:jc w:val="left"/>
+      </w:pPr>
+      <w:r>
+        <w:rPr>
+          <w:rFonts w:ascii="DejaVu Sans" w:hAnsi="DejaVu Sans" w:eastAsia="DejaVu Sans" w:cs="DejaVu Sans"/>
+          <w:b w:val="0"/>
+          <w:i w:val="0"/>
+          <w:sz w:val="22"/>
+        </w:rPr>
+        <w:t xml:space="preserve">            f"{index:&lt;3} ({key.e}, {key.n}){(20 - len(str(key.e)) - len(str(key.n))) * ' '}"</w:t>
+      </w:r>
+    </w:p>
+    <w:p>
+      <w:pPr>
+        <w:keepLines w:val="0"/>
+        <w:spacing w:before="0" w:after="0" w:line="240" w:lineRule="auto"/>
+        <w:ind w:firstLine="0" w:left="0"/>
+        <w:jc w:val="left"/>
+      </w:pPr>
+      <w:r>
+        <w:rPr>
+          <w:rFonts w:ascii="DejaVu Sans" w:hAnsi="DejaVu Sans" w:eastAsia="DejaVu Sans" w:cs="DejaVu Sans"/>
+          <w:b w:val="0"/>
+          <w:i w:val="0"/>
+          <w:sz w:val="22"/>
+        </w:rPr>
+        <w:t xml:space="preserve">            f"({key.d}, {key.n}){(20 - len(str(key.d)) - len(str(key.n))) * ' '}"</w:t>
+      </w:r>
+    </w:p>
+    <w:p>
+      <w:pPr>
+        <w:keepLines w:val="0"/>
+        <w:spacing w:before="0" w:after="0" w:line="240" w:lineRule="auto"/>
+        <w:ind w:firstLine="0" w:left="0"/>
+        <w:jc w:val="left"/>
+      </w:pPr>
+      <w:r>
+        <w:rPr>
+          <w:rFonts w:ascii="DejaVu Sans" w:hAnsi="DejaVu Sans" w:eastAsia="DejaVu Sans" w:cs="DejaVu Sans"/>
+          <w:b w:val="0"/>
+          <w:i w:val="0"/>
+          <w:sz w:val="22"/>
+        </w:rPr>
+        <w:t xml:space="preserve">            f"{(key.e * key.d) % key.phi}"</w:t>
+      </w:r>
+    </w:p>
+    <w:p>
+      <w:pPr>
+        <w:keepLines w:val="0"/>
+        <w:spacing w:before="0" w:after="0" w:line="240" w:lineRule="auto"/>
+        <w:ind w:firstLine="0" w:left="0"/>
+        <w:jc w:val="left"/>
+      </w:pPr>
+      <w:r>
+        <w:rPr>
+          <w:rFonts w:ascii="DejaVu Sans" w:hAnsi="DejaVu Sans" w:eastAsia="DejaVu Sans" w:cs="DejaVu Sans"/>
+          <w:b w:val="0"/>
+          <w:i w:val="0"/>
+          <w:sz w:val="22"/>
+        </w:rPr>
+        <w:t xml:space="preserve">        )</w:t>
       </w:r>
     </w:p>
     <w:p>
@@ -12699,7 +12784,7 @@
           <w:i w:val="0"/>
           <w:sz w:val="22"/>
         </w:rPr>
-        <w:t xml:space="preserve">            print(f"Проверка: {a}·({x}) + {b}·({y}) = {a*x + b*y}.")</w:t>
+        <w:t xml:space="preserve">            print(f"Проверка: {a}·({x}) + {b}·({y}) = {a * x + b * y}.")</w:t>
       </w:r>
     </w:p>
     <w:p>
@@ -12852,7 +12937,41 @@
           <w:i w:val="0"/>
           <w:sz w:val="22"/>
         </w:rPr>
-        <w:t xml:space="preserve">                print(f"{value}^(-1) mod {modulus} = {inverse}; проверка: {value*inverse % modulus}.")</w:t>
+        <w:t xml:space="preserve">                print(</w:t>
+      </w:r>
+    </w:p>
+    <w:p>
+      <w:pPr>
+        <w:keepLines w:val="0"/>
+        <w:spacing w:before="0" w:after="0" w:line="240" w:lineRule="auto"/>
+        <w:ind w:firstLine="0" w:left="0"/>
+        <w:jc w:val="left"/>
+      </w:pPr>
+      <w:r>
+        <w:rPr>
+          <w:rFonts w:ascii="DejaVu Sans" w:hAnsi="DejaVu Sans" w:eastAsia="DejaVu Sans" w:cs="DejaVu Sans"/>
+          <w:b w:val="0"/>
+          <w:i w:val="0"/>
+          <w:sz w:val="22"/>
+        </w:rPr>
+        <w:t xml:space="preserve">                    f"{value}^(-1) mod {modulus} = {inverse}; проверка: {value * inverse % modulus}."</w:t>
+      </w:r>
+    </w:p>
+    <w:p>
+      <w:pPr>
+        <w:keepLines w:val="0"/>
+        <w:spacing w:before="0" w:after="0" w:line="240" w:lineRule="auto"/>
+        <w:ind w:firstLine="0" w:left="0"/>
+        <w:jc w:val="left"/>
+      </w:pPr>
+      <w:r>
+        <w:rPr>
+          <w:rFonts w:ascii="DejaVu Sans" w:hAnsi="DejaVu Sans" w:eastAsia="DejaVu Sans" w:cs="DejaVu Sans"/>
+          <w:b w:val="0"/>
+          <w:i w:val="0"/>
+          <w:sz w:val="22"/>
+        </w:rPr>
+        <w:t xml:space="preserve">                )</w:t>
       </w:r>
     </w:p>
     <w:p>
@@ -13123,24 +13242,143 @@
           <w:i w:val="0"/>
           <w:sz w:val="22"/>
         </w:rPr>
-        <w:t>def save_demo(plaintext: str, encoded: str, blocks: tuple[int, ...], cipher_blocks: tuple[int, ...],</w:t>
-      </w:r>
-    </w:p>
-    <w:p>
-      <w:pPr>
-        <w:keepLines w:val="0"/>
-        <w:spacing w:before="0" w:after="0" w:line="240" w:lineRule="auto"/>
-        <w:ind w:firstLine="0" w:left="0"/>
-        <w:jc w:val="left"/>
-      </w:pPr>
-      <w:r>
-        <w:rPr>
-          <w:rFonts w:ascii="DejaVu Sans" w:hAnsi="DejaVu Sans" w:eastAsia="DejaVu Sans" w:cs="DejaVu Sans"/>
-          <w:b w:val="0"/>
-          <w:i w:val="0"/>
-          <w:sz w:val="22"/>
-        </w:rPr>
-        <w:t xml:space="preserve">              ciphertext: str, decoded: str, key: KeyPair) -&gt; Path:</w:t>
+        <w:t>def save_demo(</w:t>
+      </w:r>
+    </w:p>
+    <w:p>
+      <w:pPr>
+        <w:keepLines w:val="0"/>
+        <w:spacing w:before="0" w:after="0" w:line="240" w:lineRule="auto"/>
+        <w:ind w:firstLine="0" w:left="0"/>
+        <w:jc w:val="left"/>
+      </w:pPr>
+      <w:r>
+        <w:rPr>
+          <w:rFonts w:ascii="DejaVu Sans" w:hAnsi="DejaVu Sans" w:eastAsia="DejaVu Sans" w:cs="DejaVu Sans"/>
+          <w:b w:val="0"/>
+          <w:i w:val="0"/>
+          <w:sz w:val="22"/>
+        </w:rPr>
+        <w:t xml:space="preserve">    plaintext: str,</w:t>
+      </w:r>
+    </w:p>
+    <w:p>
+      <w:pPr>
+        <w:keepLines w:val="0"/>
+        <w:spacing w:before="0" w:after="0" w:line="240" w:lineRule="auto"/>
+        <w:ind w:firstLine="0" w:left="0"/>
+        <w:jc w:val="left"/>
+      </w:pPr>
+      <w:r>
+        <w:rPr>
+          <w:rFonts w:ascii="DejaVu Sans" w:hAnsi="DejaVu Sans" w:eastAsia="DejaVu Sans" w:cs="DejaVu Sans"/>
+          <w:b w:val="0"/>
+          <w:i w:val="0"/>
+          <w:sz w:val="22"/>
+        </w:rPr>
+        <w:t xml:space="preserve">    encoded: str,</w:t>
+      </w:r>
+    </w:p>
+    <w:p>
+      <w:pPr>
+        <w:keepLines w:val="0"/>
+        <w:spacing w:before="0" w:after="0" w:line="240" w:lineRule="auto"/>
+        <w:ind w:firstLine="0" w:left="0"/>
+        <w:jc w:val="left"/>
+      </w:pPr>
+      <w:r>
+        <w:rPr>
+          <w:rFonts w:ascii="DejaVu Sans" w:hAnsi="DejaVu Sans" w:eastAsia="DejaVu Sans" w:cs="DejaVu Sans"/>
+          <w:b w:val="0"/>
+          <w:i w:val="0"/>
+          <w:sz w:val="22"/>
+        </w:rPr>
+        <w:t xml:space="preserve">    blocks: tuple[int, ...],</w:t>
+      </w:r>
+    </w:p>
+    <w:p>
+      <w:pPr>
+        <w:keepLines w:val="0"/>
+        <w:spacing w:before="0" w:after="0" w:line="240" w:lineRule="auto"/>
+        <w:ind w:firstLine="0" w:left="0"/>
+        <w:jc w:val="left"/>
+      </w:pPr>
+      <w:r>
+        <w:rPr>
+          <w:rFonts w:ascii="DejaVu Sans" w:hAnsi="DejaVu Sans" w:eastAsia="DejaVu Sans" w:cs="DejaVu Sans"/>
+          <w:b w:val="0"/>
+          <w:i w:val="0"/>
+          <w:sz w:val="22"/>
+        </w:rPr>
+        <w:t xml:space="preserve">    cipher_blocks: tuple[int, ...],</w:t>
+      </w:r>
+    </w:p>
+    <w:p>
+      <w:pPr>
+        <w:keepLines w:val="0"/>
+        <w:spacing w:before="0" w:after="0" w:line="240" w:lineRule="auto"/>
+        <w:ind w:firstLine="0" w:left="0"/>
+        <w:jc w:val="left"/>
+      </w:pPr>
+      <w:r>
+        <w:rPr>
+          <w:rFonts w:ascii="DejaVu Sans" w:hAnsi="DejaVu Sans" w:eastAsia="DejaVu Sans" w:cs="DejaVu Sans"/>
+          <w:b w:val="0"/>
+          <w:i w:val="0"/>
+          <w:sz w:val="22"/>
+        </w:rPr>
+        <w:t xml:space="preserve">    ciphertext: str,</w:t>
+      </w:r>
+    </w:p>
+    <w:p>
+      <w:pPr>
+        <w:keepLines w:val="0"/>
+        <w:spacing w:before="0" w:after="0" w:line="240" w:lineRule="auto"/>
+        <w:ind w:firstLine="0" w:left="0"/>
+        <w:jc w:val="left"/>
+      </w:pPr>
+      <w:r>
+        <w:rPr>
+          <w:rFonts w:ascii="DejaVu Sans" w:hAnsi="DejaVu Sans" w:eastAsia="DejaVu Sans" w:cs="DejaVu Sans"/>
+          <w:b w:val="0"/>
+          <w:i w:val="0"/>
+          <w:sz w:val="22"/>
+        </w:rPr>
+        <w:t xml:space="preserve">    decoded: str,</w:t>
+      </w:r>
+    </w:p>
+    <w:p>
+      <w:pPr>
+        <w:keepLines w:val="0"/>
+        <w:spacing w:before="0" w:after="0" w:line="240" w:lineRule="auto"/>
+        <w:ind w:firstLine="0" w:left="0"/>
+        <w:jc w:val="left"/>
+      </w:pPr>
+      <w:r>
+        <w:rPr>
+          <w:rFonts w:ascii="DejaVu Sans" w:hAnsi="DejaVu Sans" w:eastAsia="DejaVu Sans" w:cs="DejaVu Sans"/>
+          <w:b w:val="0"/>
+          <w:i w:val="0"/>
+          <w:sz w:val="22"/>
+        </w:rPr>
+        <w:t xml:space="preserve">    key: KeyPair,</w:t>
+      </w:r>
+    </w:p>
+    <w:p>
+      <w:pPr>
+        <w:keepLines w:val="0"/>
+        <w:spacing w:before="0" w:after="0" w:line="240" w:lineRule="auto"/>
+        <w:ind w:firstLine="0" w:left="0"/>
+        <w:jc w:val="left"/>
+      </w:pPr>
+      <w:r>
+        <w:rPr>
+          <w:rFonts w:ascii="DejaVu Sans" w:hAnsi="DejaVu Sans" w:eastAsia="DejaVu Sans" w:cs="DejaVu Sans"/>
+          <w:b w:val="0"/>
+          <w:i w:val="0"/>
+          <w:sz w:val="22"/>
+        </w:rPr>
+        <w:t>) -&gt; Path:</w:t>
       </w:r>
     </w:p>
     <w:p>
@@ -13785,7 +14023,41 @@
           <w:i w:val="0"/>
           <w:sz w:val="22"/>
         </w:rPr>
-        <w:t xml:space="preserve">        print(f"Результат сохранён: {save_demo(result.plaintext, result.encoded_digits, result.plaintext_blocks, result.ciphertext_blocks, result.ciphertext, decoded, key)}")</w:t>
+        <w:t xml:space="preserve">        print(</w:t>
+      </w:r>
+    </w:p>
+    <w:p>
+      <w:pPr>
+        <w:keepLines w:val="0"/>
+        <w:spacing w:before="0" w:after="0" w:line="240" w:lineRule="auto"/>
+        <w:ind w:firstLine="0" w:left="0"/>
+        <w:jc w:val="left"/>
+      </w:pPr>
+      <w:r>
+        <w:rPr>
+          <w:rFonts w:ascii="DejaVu Sans" w:hAnsi="DejaVu Sans" w:eastAsia="DejaVu Sans" w:cs="DejaVu Sans"/>
+          <w:b w:val="0"/>
+          <w:i w:val="0"/>
+          <w:sz w:val="22"/>
+        </w:rPr>
+        <w:t xml:space="preserve">            f"Результат сохранён: {save_demo(result.plaintext, result.encoded_digits, result.plaintext_blocks, result.ciphertext_blocks, result.ciphertext, decoded, key)}"</w:t>
+      </w:r>
+    </w:p>
+    <w:p>
+      <w:pPr>
+        <w:keepLines w:val="0"/>
+        <w:spacing w:before="0" w:after="0" w:line="240" w:lineRule="auto"/>
+        <w:ind w:firstLine="0" w:left="0"/>
+        <w:jc w:val="left"/>
+      </w:pPr>
+      <w:r>
+        <w:rPr>
+          <w:rFonts w:ascii="DejaVu Sans" w:hAnsi="DejaVu Sans" w:eastAsia="DejaVu Sans" w:cs="DejaVu Sans"/>
+          <w:b w:val="0"/>
+          <w:i w:val="0"/>
+          <w:sz w:val="22"/>
+        </w:rPr>
+        <w:t xml:space="preserve">        )</w:t>
       </w:r>
     </w:p>
     <w:p>

</xml_diff>

<commit_message>
Use trial division for RSA prime checks
</commit_message>
<xml_diff>
--- a/lab_4/report.docx
+++ b/lab_4/report.docx
@@ -4563,59 +4563,23 @@
           <w:b w:val="0"/>
           <w:i w:val="0"/>
         </w:rPr>
-        <w:t xml:space="preserve">Программа использует тест Миллера–Рабина для проверки простоты. Для целых чисел меньше </w:t>
-      </w:r>
-      <m:oMath>
-        <m:box>
-          <m:e>
-            <m:sSup>
-              <m:e>
-                <m:r>
-                  <m:rPr>
-                    <m:sty m:val="p"/>
-                  </m:rPr>
-                  <m:t>2</m:t>
-                </m:r>
-              </m:e>
-              <m:sup>
-                <m:box>
-                  <m:e>
-                    <m:r>
-                      <m:rPr>
-                        <m:sty m:val="p"/>
-                      </m:rPr>
-                      <m:t>64</m:t>
-                    </m:r>
-                  </m:e>
-                </m:box>
-              </m:sup>
-            </m:sSup>
-          </m:e>
-        </m:box>
-      </m:oMath>
+        <w:t xml:space="preserve">Простота числа проверяется пробным делением: сначала обрабатываются числа меньше 2 и отдельно число 2, затем отбрасываются чётные числа. Для нечётного числа перебираются нечётные делители от 3, пока квадрат делителя не превысит проверяемое число. Если делитель найден, число составное; если проверка закончилась без делителя, число простое. Достаточно проверять делители до квадратного корня: если число составное, у него обязательно есть множитель не больше этого корня. Алгоритм прост для проверки вручную и подходит для небольших чисел из таблицы вариантов; его время работы растёт примерно как квадратный корень из числа. Реализация </w:t>
+      </w:r>
       <w:r>
         <w:rPr>
           <w:rFonts w:ascii="Times New Roman" w:hAnsi="Times New Roman" w:eastAsia="Times New Roman" w:cs="Times New Roman"/>
           <w:b w:val="0"/>
-          <w:i w:val="0"/>
-        </w:rPr>
-        <w:t xml:space="preserve"> используемый набор оснований детерминирован; для больших значений тест является вероятностным. Реализация </w:t>
+          <w:i/>
+        </w:rPr>
+        <w:t>RSA</w:t>
       </w:r>
       <w:r>
         <w:rPr>
           <w:rFonts w:ascii="Times New Roman" w:hAnsi="Times New Roman" w:eastAsia="Times New Roman" w:cs="Times New Roman"/>
           <w:b w:val="0"/>
-          <w:i/>
-        </w:rPr>
-        <w:t>RSA</w:t>
-      </w:r>
-      <w:r>
-        <w:rPr>
-          <w:rFonts w:ascii="Times New Roman" w:hAnsi="Times New Roman" w:eastAsia="Times New Roman" w:cs="Times New Roman"/>
-          <w:b w:val="0"/>
-          <w:i w:val="0"/>
-        </w:rPr>
-        <w:t xml:space="preserve"> предназначена для изучения алгоритма и не использует криптографически стойкую генерацию ключей или дополнение сообщения.</w:t>
+          <w:i w:val="0"/>
+        </w:rPr>
+        <w:t xml:space="preserve"> предназначена для изучения и не использует криптографически стойкую генерацию ключей или дополнение сообщения.</w:t>
       </w:r>
     </w:p>
     <w:p>
@@ -8692,7 +8656,7 @@
           <w:i w:val="0"/>
           <w:sz w:val="22"/>
         </w:rPr>
-        <w:t xml:space="preserve">    """Тест Миллера—Рабина; точен для n &lt; 2**64, вероятностный выше."""</w:t>
+        <w:t xml:space="preserve">    """Проверить простоту перебором делителей до квадратного корня числа."""</w:t>
       </w:r>
     </w:p>
     <w:p>
@@ -8743,75 +8707,117 @@
           <w:i w:val="0"/>
           <w:sz w:val="22"/>
         </w:rPr>
-        <w:t xml:space="preserve">    small_primes = (2, 3, 5, 7, 11, 13, 17, 19, 23, 29, 31, 37)</w:t>
-      </w:r>
-    </w:p>
-    <w:p>
-      <w:pPr>
-        <w:keepLines w:val="0"/>
-        <w:spacing w:before="0" w:after="0" w:line="240" w:lineRule="auto"/>
-        <w:ind w:firstLine="0" w:left="0"/>
-        <w:jc w:val="left"/>
-      </w:pPr>
-      <w:r>
-        <w:rPr>
-          <w:rFonts w:ascii="DejaVu Sans" w:hAnsi="DejaVu Sans" w:eastAsia="DejaVu Sans" w:cs="DejaVu Sans"/>
-          <w:b w:val="0"/>
-          <w:i w:val="0"/>
-          <w:sz w:val="22"/>
-        </w:rPr>
-        <w:t xml:space="preserve">    for prime in small_primes:</w:t>
-      </w:r>
-    </w:p>
-    <w:p>
-      <w:pPr>
-        <w:keepLines w:val="0"/>
-        <w:spacing w:before="0" w:after="0" w:line="240" w:lineRule="auto"/>
-        <w:ind w:firstLine="0" w:left="0"/>
-        <w:jc w:val="left"/>
-      </w:pPr>
-      <w:r>
-        <w:rPr>
-          <w:rFonts w:ascii="DejaVu Sans" w:hAnsi="DejaVu Sans" w:eastAsia="DejaVu Sans" w:cs="DejaVu Sans"/>
-          <w:b w:val="0"/>
-          <w:i w:val="0"/>
-          <w:sz w:val="22"/>
-        </w:rPr>
-        <w:t xml:space="preserve">        if number == prime:</w:t>
-      </w:r>
-    </w:p>
-    <w:p>
-      <w:pPr>
-        <w:keepLines w:val="0"/>
-        <w:spacing w:before="0" w:after="0" w:line="240" w:lineRule="auto"/>
-        <w:ind w:firstLine="0" w:left="0"/>
-        <w:jc w:val="left"/>
-      </w:pPr>
-      <w:r>
-        <w:rPr>
-          <w:rFonts w:ascii="DejaVu Sans" w:hAnsi="DejaVu Sans" w:eastAsia="DejaVu Sans" w:cs="DejaVu Sans"/>
-          <w:b w:val="0"/>
-          <w:i w:val="0"/>
-          <w:sz w:val="22"/>
-        </w:rPr>
-        <w:t xml:space="preserve">            return True</w:t>
-      </w:r>
-    </w:p>
-    <w:p>
-      <w:pPr>
-        <w:keepLines w:val="0"/>
-        <w:spacing w:before="0" w:after="0" w:line="240" w:lineRule="auto"/>
-        <w:ind w:firstLine="0" w:left="0"/>
-        <w:jc w:val="left"/>
-      </w:pPr>
-      <w:r>
-        <w:rPr>
-          <w:rFonts w:ascii="DejaVu Sans" w:hAnsi="DejaVu Sans" w:eastAsia="DejaVu Sans" w:cs="DejaVu Sans"/>
-          <w:b w:val="0"/>
-          <w:i w:val="0"/>
-          <w:sz w:val="22"/>
-        </w:rPr>
-        <w:t xml:space="preserve">        if number % prime == 0:</w:t>
+        <w:t xml:space="preserve">    if number == 2:</w:t>
+      </w:r>
+    </w:p>
+    <w:p>
+      <w:pPr>
+        <w:keepLines w:val="0"/>
+        <w:spacing w:before="0" w:after="0" w:line="240" w:lineRule="auto"/>
+        <w:ind w:firstLine="0" w:left="0"/>
+        <w:jc w:val="left"/>
+      </w:pPr>
+      <w:r>
+        <w:rPr>
+          <w:rFonts w:ascii="DejaVu Sans" w:hAnsi="DejaVu Sans" w:eastAsia="DejaVu Sans" w:cs="DejaVu Sans"/>
+          <w:b w:val="0"/>
+          <w:i w:val="0"/>
+          <w:sz w:val="22"/>
+        </w:rPr>
+        <w:t xml:space="preserve">        return True</w:t>
+      </w:r>
+    </w:p>
+    <w:p>
+      <w:pPr>
+        <w:keepLines w:val="0"/>
+        <w:spacing w:before="0" w:after="0" w:line="240" w:lineRule="auto"/>
+        <w:ind w:firstLine="0" w:left="0"/>
+        <w:jc w:val="left"/>
+      </w:pPr>
+      <w:r>
+        <w:rPr>
+          <w:rFonts w:ascii="DejaVu Sans" w:hAnsi="DejaVu Sans" w:eastAsia="DejaVu Sans" w:cs="DejaVu Sans"/>
+          <w:b w:val="0"/>
+          <w:i w:val="0"/>
+          <w:sz w:val="22"/>
+        </w:rPr>
+        <w:t xml:space="preserve">    if number % 2 == 0:</w:t>
+      </w:r>
+    </w:p>
+    <w:p>
+      <w:pPr>
+        <w:keepLines w:val="0"/>
+        <w:spacing w:before="0" w:after="0" w:line="240" w:lineRule="auto"/>
+        <w:ind w:firstLine="0" w:left="0"/>
+        <w:jc w:val="left"/>
+      </w:pPr>
+      <w:r>
+        <w:rPr>
+          <w:rFonts w:ascii="DejaVu Sans" w:hAnsi="DejaVu Sans" w:eastAsia="DejaVu Sans" w:cs="DejaVu Sans"/>
+          <w:b w:val="0"/>
+          <w:i w:val="0"/>
+          <w:sz w:val="22"/>
+        </w:rPr>
+        <w:t xml:space="preserve">        return False</w:t>
+      </w:r>
+    </w:p>
+    <w:p>
+      <w:pPr>
+        <w:keepLines w:val="0"/>
+        <w:spacing w:before="0" w:after="0" w:line="240" w:lineRule="auto"/>
+        <w:ind w:firstLine="0" w:left="0"/>
+        <w:jc w:val="left"/>
+      </w:pPr>
+    </w:p>
+    <w:p>
+      <w:pPr>
+        <w:keepLines w:val="0"/>
+        <w:spacing w:before="0" w:after="0" w:line="240" w:lineRule="auto"/>
+        <w:ind w:firstLine="0" w:left="0"/>
+        <w:jc w:val="left"/>
+      </w:pPr>
+      <w:r>
+        <w:rPr>
+          <w:rFonts w:ascii="DejaVu Sans" w:hAnsi="DejaVu Sans" w:eastAsia="DejaVu Sans" w:cs="DejaVu Sans"/>
+          <w:b w:val="0"/>
+          <w:i w:val="0"/>
+          <w:sz w:val="22"/>
+        </w:rPr>
+        <w:t xml:space="preserve">    divisor = 3</w:t>
+      </w:r>
+    </w:p>
+    <w:p>
+      <w:pPr>
+        <w:keepLines w:val="0"/>
+        <w:spacing w:before="0" w:after="0" w:line="240" w:lineRule="auto"/>
+        <w:ind w:firstLine="0" w:left="0"/>
+        <w:jc w:val="left"/>
+      </w:pPr>
+      <w:r>
+        <w:rPr>
+          <w:rFonts w:ascii="DejaVu Sans" w:hAnsi="DejaVu Sans" w:eastAsia="DejaVu Sans" w:cs="DejaVu Sans"/>
+          <w:b w:val="0"/>
+          <w:i w:val="0"/>
+          <w:sz w:val="22"/>
+        </w:rPr>
+        <w:t xml:space="preserve">    while divisor * divisor &lt;= number:</w:t>
+      </w:r>
+    </w:p>
+    <w:p>
+      <w:pPr>
+        <w:keepLines w:val="0"/>
+        <w:spacing w:before="0" w:after="0" w:line="240" w:lineRule="auto"/>
+        <w:ind w:firstLine="0" w:left="0"/>
+        <w:jc w:val="left"/>
+      </w:pPr>
+      <w:r>
+        <w:rPr>
+          <w:rFonts w:ascii="DejaVu Sans" w:hAnsi="DejaVu Sans" w:eastAsia="DejaVu Sans" w:cs="DejaVu Sans"/>
+          <w:b w:val="0"/>
+          <w:i w:val="0"/>
+          <w:sz w:val="22"/>
+        </w:rPr>
+        <w:t xml:space="preserve">        if number % divisor == 0:</w:t>
       </w:r>
     </w:p>
     <w:p>
@@ -8845,296 +8851,7 @@
           <w:i w:val="0"/>
           <w:sz w:val="22"/>
         </w:rPr>
-        <w:t xml:space="preserve">    odd_part = number - 1</w:t>
-      </w:r>
-    </w:p>
-    <w:p>
-      <w:pPr>
-        <w:keepLines w:val="0"/>
-        <w:spacing w:before="0" w:after="0" w:line="240" w:lineRule="auto"/>
-        <w:ind w:firstLine="0" w:left="0"/>
-        <w:jc w:val="left"/>
-      </w:pPr>
-      <w:r>
-        <w:rPr>
-          <w:rFonts w:ascii="DejaVu Sans" w:hAnsi="DejaVu Sans" w:eastAsia="DejaVu Sans" w:cs="DejaVu Sans"/>
-          <w:b w:val="0"/>
-          <w:i w:val="0"/>
-          <w:sz w:val="22"/>
-        </w:rPr>
-        <w:t xml:space="preserve">    shifts = 0</w:t>
-      </w:r>
-    </w:p>
-    <w:p>
-      <w:pPr>
-        <w:keepLines w:val="0"/>
-        <w:spacing w:before="0" w:after="0" w:line="240" w:lineRule="auto"/>
-        <w:ind w:firstLine="0" w:left="0"/>
-        <w:jc w:val="left"/>
-      </w:pPr>
-      <w:r>
-        <w:rPr>
-          <w:rFonts w:ascii="DejaVu Sans" w:hAnsi="DejaVu Sans" w:eastAsia="DejaVu Sans" w:cs="DejaVu Sans"/>
-          <w:b w:val="0"/>
-          <w:i w:val="0"/>
-          <w:sz w:val="22"/>
-        </w:rPr>
-        <w:t xml:space="preserve">    while odd_part % 2 == 0:</w:t>
-      </w:r>
-    </w:p>
-    <w:p>
-      <w:pPr>
-        <w:keepLines w:val="0"/>
-        <w:spacing w:before="0" w:after="0" w:line="240" w:lineRule="auto"/>
-        <w:ind w:firstLine="0" w:left="0"/>
-        <w:jc w:val="left"/>
-      </w:pPr>
-      <w:r>
-        <w:rPr>
-          <w:rFonts w:ascii="DejaVu Sans" w:hAnsi="DejaVu Sans" w:eastAsia="DejaVu Sans" w:cs="DejaVu Sans"/>
-          <w:b w:val="0"/>
-          <w:i w:val="0"/>
-          <w:sz w:val="22"/>
-        </w:rPr>
-        <w:t xml:space="preserve">        shifts += 1</w:t>
-      </w:r>
-    </w:p>
-    <w:p>
-      <w:pPr>
-        <w:keepLines w:val="0"/>
-        <w:spacing w:before="0" w:after="0" w:line="240" w:lineRule="auto"/>
-        <w:ind w:firstLine="0" w:left="0"/>
-        <w:jc w:val="left"/>
-      </w:pPr>
-      <w:r>
-        <w:rPr>
-          <w:rFonts w:ascii="DejaVu Sans" w:hAnsi="DejaVu Sans" w:eastAsia="DejaVu Sans" w:cs="DejaVu Sans"/>
-          <w:b w:val="0"/>
-          <w:i w:val="0"/>
-          <w:sz w:val="22"/>
-        </w:rPr>
-        <w:t xml:space="preserve">        odd_part //= 2</w:t>
-      </w:r>
-    </w:p>
-    <w:p>
-      <w:pPr>
-        <w:keepLines w:val="0"/>
-        <w:spacing w:before="0" w:after="0" w:line="240" w:lineRule="auto"/>
-        <w:ind w:firstLine="0" w:left="0"/>
-        <w:jc w:val="left"/>
-      </w:pPr>
-      <w:r>
-        <w:rPr>
-          <w:rFonts w:ascii="DejaVu Sans" w:hAnsi="DejaVu Sans" w:eastAsia="DejaVu Sans" w:cs="DejaVu Sans"/>
-          <w:b w:val="0"/>
-          <w:i w:val="0"/>
-          <w:sz w:val="22"/>
-        </w:rPr>
-        <w:t xml:space="preserve">    bases = (2, 325, 9375, 28178, 450775, 9780504, 1795265022)</w:t>
-      </w:r>
-    </w:p>
-    <w:p>
-      <w:pPr>
-        <w:keepLines w:val="0"/>
-        <w:spacing w:before="0" w:after="0" w:line="240" w:lineRule="auto"/>
-        <w:ind w:firstLine="0" w:left="0"/>
-        <w:jc w:val="left"/>
-      </w:pPr>
-      <w:r>
-        <w:rPr>
-          <w:rFonts w:ascii="DejaVu Sans" w:hAnsi="DejaVu Sans" w:eastAsia="DejaVu Sans" w:cs="DejaVu Sans"/>
-          <w:b w:val="0"/>
-          <w:i w:val="0"/>
-          <w:sz w:val="22"/>
-        </w:rPr>
-        <w:t xml:space="preserve">    for base in bases:</w:t>
-      </w:r>
-    </w:p>
-    <w:p>
-      <w:pPr>
-        <w:keepLines w:val="0"/>
-        <w:spacing w:before="0" w:after="0" w:line="240" w:lineRule="auto"/>
-        <w:ind w:firstLine="0" w:left="0"/>
-        <w:jc w:val="left"/>
-      </w:pPr>
-      <w:r>
-        <w:rPr>
-          <w:rFonts w:ascii="DejaVu Sans" w:hAnsi="DejaVu Sans" w:eastAsia="DejaVu Sans" w:cs="DejaVu Sans"/>
-          <w:b w:val="0"/>
-          <w:i w:val="0"/>
-          <w:sz w:val="22"/>
-        </w:rPr>
-        <w:t xml:space="preserve">        if base % number == 0:</w:t>
-      </w:r>
-    </w:p>
-    <w:p>
-      <w:pPr>
-        <w:keepLines w:val="0"/>
-        <w:spacing w:before="0" w:after="0" w:line="240" w:lineRule="auto"/>
-        <w:ind w:firstLine="0" w:left="0"/>
-        <w:jc w:val="left"/>
-      </w:pPr>
-      <w:r>
-        <w:rPr>
-          <w:rFonts w:ascii="DejaVu Sans" w:hAnsi="DejaVu Sans" w:eastAsia="DejaVu Sans" w:cs="DejaVu Sans"/>
-          <w:b w:val="0"/>
-          <w:i w:val="0"/>
-          <w:sz w:val="22"/>
-        </w:rPr>
-        <w:t xml:space="preserve">            continue</w:t>
-      </w:r>
-    </w:p>
-    <w:p>
-      <w:pPr>
-        <w:keepLines w:val="0"/>
-        <w:spacing w:before="0" w:after="0" w:line="240" w:lineRule="auto"/>
-        <w:ind w:firstLine="0" w:left="0"/>
-        <w:jc w:val="left"/>
-      </w:pPr>
-      <w:r>
-        <w:rPr>
-          <w:rFonts w:ascii="DejaVu Sans" w:hAnsi="DejaVu Sans" w:eastAsia="DejaVu Sans" w:cs="DejaVu Sans"/>
-          <w:b w:val="0"/>
-          <w:i w:val="0"/>
-          <w:sz w:val="22"/>
-        </w:rPr>
-        <w:t xml:space="preserve">        residue = modular_power(base, odd_part, number)</w:t>
-      </w:r>
-    </w:p>
-    <w:p>
-      <w:pPr>
-        <w:keepLines w:val="0"/>
-        <w:spacing w:before="0" w:after="0" w:line="240" w:lineRule="auto"/>
-        <w:ind w:firstLine="0" w:left="0"/>
-        <w:jc w:val="left"/>
-      </w:pPr>
-      <w:r>
-        <w:rPr>
-          <w:rFonts w:ascii="DejaVu Sans" w:hAnsi="DejaVu Sans" w:eastAsia="DejaVu Sans" w:cs="DejaVu Sans"/>
-          <w:b w:val="0"/>
-          <w:i w:val="0"/>
-          <w:sz w:val="22"/>
-        </w:rPr>
-        <w:t xml:space="preserve">        if residue in (1, number - 1):</w:t>
-      </w:r>
-    </w:p>
-    <w:p>
-      <w:pPr>
-        <w:keepLines w:val="0"/>
-        <w:spacing w:before="0" w:after="0" w:line="240" w:lineRule="auto"/>
-        <w:ind w:firstLine="0" w:left="0"/>
-        <w:jc w:val="left"/>
-      </w:pPr>
-      <w:r>
-        <w:rPr>
-          <w:rFonts w:ascii="DejaVu Sans" w:hAnsi="DejaVu Sans" w:eastAsia="DejaVu Sans" w:cs="DejaVu Sans"/>
-          <w:b w:val="0"/>
-          <w:i w:val="0"/>
-          <w:sz w:val="22"/>
-        </w:rPr>
-        <w:t xml:space="preserve">            continue</w:t>
-      </w:r>
-    </w:p>
-    <w:p>
-      <w:pPr>
-        <w:keepLines w:val="0"/>
-        <w:spacing w:before="0" w:after="0" w:line="240" w:lineRule="auto"/>
-        <w:ind w:firstLine="0" w:left="0"/>
-        <w:jc w:val="left"/>
-      </w:pPr>
-      <w:r>
-        <w:rPr>
-          <w:rFonts w:ascii="DejaVu Sans" w:hAnsi="DejaVu Sans" w:eastAsia="DejaVu Sans" w:cs="DejaVu Sans"/>
-          <w:b w:val="0"/>
-          <w:i w:val="0"/>
-          <w:sz w:val="22"/>
-        </w:rPr>
-        <w:t xml:space="preserve">        for _ in range(shifts - 1):</w:t>
-      </w:r>
-    </w:p>
-    <w:p>
-      <w:pPr>
-        <w:keepLines w:val="0"/>
-        <w:spacing w:before="0" w:after="0" w:line="240" w:lineRule="auto"/>
-        <w:ind w:firstLine="0" w:left="0"/>
-        <w:jc w:val="left"/>
-      </w:pPr>
-      <w:r>
-        <w:rPr>
-          <w:rFonts w:ascii="DejaVu Sans" w:hAnsi="DejaVu Sans" w:eastAsia="DejaVu Sans" w:cs="DejaVu Sans"/>
-          <w:b w:val="0"/>
-          <w:i w:val="0"/>
-          <w:sz w:val="22"/>
-        </w:rPr>
-        <w:t xml:space="preserve">            residue = (residue * residue) % number</w:t>
-      </w:r>
-    </w:p>
-    <w:p>
-      <w:pPr>
-        <w:keepLines w:val="0"/>
-        <w:spacing w:before="0" w:after="0" w:line="240" w:lineRule="auto"/>
-        <w:ind w:firstLine="0" w:left="0"/>
-        <w:jc w:val="left"/>
-      </w:pPr>
-      <w:r>
-        <w:rPr>
-          <w:rFonts w:ascii="DejaVu Sans" w:hAnsi="DejaVu Sans" w:eastAsia="DejaVu Sans" w:cs="DejaVu Sans"/>
-          <w:b w:val="0"/>
-          <w:i w:val="0"/>
-          <w:sz w:val="22"/>
-        </w:rPr>
-        <w:t xml:space="preserve">            if residue == number - 1:</w:t>
-      </w:r>
-    </w:p>
-    <w:p>
-      <w:pPr>
-        <w:keepLines w:val="0"/>
-        <w:spacing w:before="0" w:after="0" w:line="240" w:lineRule="auto"/>
-        <w:ind w:firstLine="0" w:left="0"/>
-        <w:jc w:val="left"/>
-      </w:pPr>
-      <w:r>
-        <w:rPr>
-          <w:rFonts w:ascii="DejaVu Sans" w:hAnsi="DejaVu Sans" w:eastAsia="DejaVu Sans" w:cs="DejaVu Sans"/>
-          <w:b w:val="0"/>
-          <w:i w:val="0"/>
-          <w:sz w:val="22"/>
-        </w:rPr>
-        <w:t xml:space="preserve">                break</w:t>
-      </w:r>
-    </w:p>
-    <w:p>
-      <w:pPr>
-        <w:keepLines w:val="0"/>
-        <w:spacing w:before="0" w:after="0" w:line="240" w:lineRule="auto"/>
-        <w:ind w:firstLine="0" w:left="0"/>
-        <w:jc w:val="left"/>
-      </w:pPr>
-      <w:r>
-        <w:rPr>
-          <w:rFonts w:ascii="DejaVu Sans" w:hAnsi="DejaVu Sans" w:eastAsia="DejaVu Sans" w:cs="DejaVu Sans"/>
-          <w:b w:val="0"/>
-          <w:i w:val="0"/>
-          <w:sz w:val="22"/>
-        </w:rPr>
-        <w:t xml:space="preserve">        else:</w:t>
-      </w:r>
-    </w:p>
-    <w:p>
-      <w:pPr>
-        <w:keepLines w:val="0"/>
-        <w:spacing w:before="0" w:after="0" w:line="240" w:lineRule="auto"/>
-        <w:ind w:firstLine="0" w:left="0"/>
-        <w:jc w:val="left"/>
-      </w:pPr>
-      <w:r>
-        <w:rPr>
-          <w:rFonts w:ascii="DejaVu Sans" w:hAnsi="DejaVu Sans" w:eastAsia="DejaVu Sans" w:cs="DejaVu Sans"/>
-          <w:b w:val="0"/>
-          <w:i w:val="0"/>
-          <w:sz w:val="22"/>
-        </w:rPr>
-        <w:t xml:space="preserve">            return False</w:t>
+        <w:t xml:space="preserve">        divisor += 2</w:t>
       </w:r>
     </w:p>
     <w:p>

</xml_diff>